<commit_message>
docs: actualize delivery set (own service, phone hangup, role model, GPU voice cycle)
</commit_message>
<xml_diff>
--- a/output/documentation-2026-09-28/04_Руководство_ученика.docx
+++ b/output/documentation-2026-09-28/04_Руководство_ученика.docx
@@ -261,7 +261,7 @@
         </w:rPr>
         <w:t>3.4 Получение докладов и запрос обстановки</w:t>
         <w:tab/>
-        <w:t>7</w:t>
+        <w:t>8</w:t>
       </w:r>
     </w:p>
     <w:p>
@@ -278,7 +278,7 @@
         </w:rPr>
         <w:t>3.5 Изменение статуса и комментария</w:t>
         <w:tab/>
-        <w:t>8</w:t>
+        <w:t>9</w:t>
       </w:r>
     </w:p>
     <w:p>
@@ -295,7 +295,7 @@
         </w:rPr>
         <w:t>3.6 Несколько происшествий</w:t>
         <w:tab/>
-        <w:t>9</w:t>
+        <w:t>10</w:t>
       </w:r>
     </w:p>
     <w:p>
@@ -312,7 +312,7 @@
         </w:rPr>
         <w:t>3.7 Карта и справочные материалы</w:t>
         <w:tab/>
-        <w:t>9</w:t>
+        <w:t>10</w:t>
       </w:r>
     </w:p>
     <w:p>
@@ -329,7 +329,7 @@
         </w:rPr>
         <w:t>3.8 Завершение и результат</w:t>
         <w:tab/>
-        <w:t>10</w:t>
+        <w:t>11</w:t>
       </w:r>
     </w:p>
     <w:p>
@@ -346,7 +346,7 @@
         </w:rPr>
         <w:t>4 Дополнительный режим полного цикла 112</w:t>
         <w:tab/>
-        <w:t>11</w:t>
+        <w:t>12</w:t>
       </w:r>
     </w:p>
     <w:p>
@@ -363,7 +363,7 @@
         </w:rPr>
         <w:t>5 Сообщения оператору</w:t>
         <w:tab/>
-        <w:t>11</w:t>
+        <w:t>12</w:t>
       </w:r>
     </w:p>
     <w:p>
@@ -1085,6 +1085,11 @@
     </w:p>
     <w:p>
       <w:r>
+        <w:t>Ученик работает за ту ДДС, которая задана в сценарии: её плитка подписана «моя служба», статусы ставятся только по ней. Какие службы попадают в ленту, определяет профиль ДДС, выбранный преподавателем для занятия. История службы и полоса статуса открываются по очереди: раскрытие одной закрывает другую.</w:t>
+      </w:r>
+    </w:p>
+    <w:p>
+      <w:r>
         <w:t>Не выбирайте другой статус только для того, чтобы приблизить завершение упражнения. Состояние службы должно соответствовать фактически полученному докладу. Если необходимый статус недоступен, проверьте вводные, телефонный доклад и назначенную бригаду.</w:t>
       </w:r>
     </w:p>
@@ -1260,12 +1265,12 @@
     </w:p>
     <w:p>
       <w:r>
-        <w:t>Откройте инструменты карточки и выберите бригаду из списка. Укажите, кем принято решение, если это требуется заданием. Передайте дежурному адрес, тип события, опасности и сведения о пострадавших.</w:t>
+        <w:t>Откройте инструменты карточки и выберите бригаду из списка. Укажите, кем принято решение, если это требуется заданием. Передайте бригаде или начальнику дежурной смены адрес, тип события, опасности и сведения о пострадавших.</w:t>
       </w:r>
     </w:p>
     <w:p>
       <w:r>
-        <w:t>Для голосового задания нажмите «Доложить по телефону». На MicroSIP поступит звонок от тренажёра; ответьте и дождитесь обращения дежурного. Произнесите доклад и ответьте на уточнения. Дождитесь подтверждения приёма, после чего завершите телефонограмму предусмотренной кнопкой. Собеседник — руководитель назначенной бригады либо вышестоящий начальник (начальник дежурной смены).</w:t>
+        <w:t>Для голосового задания нажмите «Доложить по телефону». На MicroSIP поступит звонок от тренажёра; ответьте и дождитесь, когда собеседник представится. Произнесите доклад и ответьте на уточнения. Дождитесь подтверждения приёма, после чего завершите телефонограмму предусмотренной кнопкой. Собеседник — руководитель назначенной бригады либо вышестоящий начальник (начальник дежурной смены).</w:t>
       </w:r>
     </w:p>
     <w:p>
@@ -1567,6 +1572,11 @@
     <w:p>
       <w:r>
         <w:t>Говорите после окончания реплики ИИ. Во время воспроизведения входящий звук подавляется защитой от эха, поэтому одновременный вопрос может не распознаться. Для модели установлен предел ожидания 15 секунд; распознавание и озвучивание занимают дополнительное время.</w:t>
+      </w:r>
+    </w:p>
+    <w:p>
+      <w:r>
+        <w:t>Бригада представляется позывным один раз: «Бригада 17 выехала на улицу Учебную, дом 12». Номера можно называть словами — «дом двенадцать» засчитывается как дом 12. Разговор завершается кнопкой на сайте или сбросом трубки: если все сведения уже переданы, доклад принимается автоматически и записывается телефонограммой; если трубку положили раньше, позвоните снова. Пока идёт разговор, учебный номер занят, и сайт сообщает об этом отдельным сообщением.</w:t>
       </w:r>
     </w:p>
     <w:p>

</xml_diff>